<commit_message>
25410262 Nguyen Duc Nghia - Dong bo Chuong 2 voi pham vi moi cua QL1 va CL2, sua ty le lead time bi lech
- Chuong 2 muc 2.5.4 (QL1): bang buoc AS-IS van con cac buoc can doi chieu PO, kiem
  cam quan / test du luong, lap NCR, nhap kho gan tem — thuoc pham vi QL2. Thay bang
  buoc 18 (ghi nhan OTIF), buoc 19 (ban giao lo hang cho QL2, ghi ro cac buoc ben
  trong khong mo ta lai), buoc 20 (cong quyet dinh ket qua QL2) va 20a (yeu cau NCC
  giao bu).
- Chuong 2 muc 2.6 (CL2): truoc gio van la ban cu 14 buoc, 1 pool. Dong bo lai voi
  file phan tich CL2 da dung lai: 29 buoc, 2 pool, day du cac cong dieu kien moi
  (xac minh don, gio cao diem, can trong luong thuc, xe giu lanh, giao lai lan 2,
  khach nhan/tu choi), 2 call activity sang CL4 va HT1. Cap nhat luon muc tieu,
  pham vi, bang KPI, diem nghen va rui ro.
- Sua ty le "tham dinh NCC chiem 27% lead time" thanh 21% cho khop lead time moi
  (5 ngay / 23,8 ngay) o ca 2 cho trong file QL1.
</commit_message>
<xml_diff>
--- a/IE203-Nhom7/25410262_NguyenDucNghia/Quy_trinh_Mua_hang_Chuoi_cung_ung/Phan_tich_Mua_hang_Chuoi_cung_ung.docx
+++ b/IE203-Nhom7/25410262_NguyenDucNghia/Quy_trinh_Mua_hang_Chuoi_cung_ung/Phan_tich_Mua_hang_Chuoi_cung_ung.docx
@@ -14830,7 +14830,7 @@
               <a:graphicData uri="http://schemas.openxmlformats.org/drawingml/2006/picture">
                 <pic:pic>
                   <pic:nvPicPr>
-                    <pic:cNvPr id="0" name="out.png"/>
+                    <pic:cNvPr id="0" name="image.png"/>
                     <pic:cNvPicPr/>
                   </pic:nvPicPr>
                   <pic:blipFill>
@@ -15560,7 +15560,7 @@
           <w:rFonts w:ascii="Times New Roman" w:hAnsi="Times New Roman"/>
           <w:sz w:val="23"/>
         </w:rPr>
-        <w:t>Thẩm định NCC mới mất 5 ngày chờ kết quả kiểm nghiệm mẫu tại lab và đánh giá thực địa nông trại — chiếm khoảng 27% lead time của chu trình có phê duyệt NCC.</w:t>
+        <w:t>Thẩm định NCC mới mất 5 ngày chờ kết quả kiểm nghiệm mẫu tại lab và đánh giá thực địa nông trại — chiếm khoảng 21% lead time của chu trình có phê duyệt NCC.</w:t>
       </w:r>
     </w:p>
     <w:p>
@@ -18744,7 +18744,7 @@
                 <w:b w:val="0"/>
                 <w:sz w:val="18"/>
               </w:rPr>
-              <w:t>Chiếm ~27% lead time chu trình có phê duyệt NCC</w:t>
+              <w:t>Chiếm ~21% lead time chu trình có phê duyệt NCC</w:t>
             </w:r>
           </w:p>
         </w:tc>
@@ -20168,7 +20168,7 @@
               <a:graphicData uri="http://schemas.openxmlformats.org/drawingml/2006/picture">
                 <pic:pic>
                   <pic:nvPicPr>
-                    <pic:cNvPr id="0" name="fish.png"/>
+                    <pic:cNvPr id="0" name="image.png"/>
                     <pic:cNvPicPr/>
                   </pic:nvPicPr>
                   <pic:blipFill>

</xml_diff>